<commit_message>
Atualiza manuais: capturas novas e fluxo de encerramento
- Capturas de tela regeneradas mostrando a coluna "Número da sorte" na
  tabela de contemplados e as mensagens de validação atuais (inclusive
  o exemplo de divergência por certificado).
- Instruções de uso atualizadas para o novo fluxo sem janela de
  terminal: encerrar pelo "Encerrar Apuracao.bat" em vez de fechar a
  janela preta.
- Nota de que o número da sorte é informativo (não entra na validação,
  que é feita por certificado).

Vale para o MANUAL_USUARIO.md e o .docx institucional; a página web
(Artifact) foi republicada na mesma URL.
</commit_message>
<xml_diff>
--- a/Manual do Usuário - Apuração de Sorteio.docx
+++ b/Manual do Usuário - Apuração de Sorteio.docx
@@ -533,7 +533,7 @@
           <w:color w:val="333333"/>
           <w:sz w:val="21"/>
         </w:rPr>
-        <w:t>Dê um duplo clique em “Iniciar Apuracao.bat”. Na primeira vez, o app instala seus componentes automaticamente (cerca de 1 minuto). Se aparecer o aviso azul “O Windows protegeu o computador”, clique em “Mais informações” e depois “Executar assim mesmo”.</w:t>
+        <w:t>Dê um duplo clique em “Iniciar Apuracao.bat”. Na primeira vez, aparece uma janela instalando os componentes (cerca de 1 minuto) — depois ela fecha sozinha. Se aparecer o aviso azul “O Windows protegeu o computador”, clique em “Mais informações” e depois “Executar assim mesmo”.</w:t>
       </w:r>
     </w:p>
     <w:p>
@@ -565,7 +565,39 @@
           <w:color w:val="333333"/>
           <w:sz w:val="21"/>
         </w:rPr>
-        <w:t>O navegador abre sozinho em http://localhost:8510. Se não abrir, digite esse endereço no navegador. Para encerrar o app, feche a janela preta (prompt de comando).</w:t>
+        <w:t>O navegador abre sozinho em http://localhost:8510 e o app fica rodando em segundo plano, sem manter nenhuma janela aberta. Se o navegador não abrir, digite esse endereço — ou dê outro duplo clique no “Iniciar Apuracao.bat”, que apenas reabre a página quando o app já está ativo.</w:t>
+      </w:r>
+    </w:p>
+    <w:p>
+      <w:pPr>
+        <w:spacing w:after="120" w:line="300" w:lineRule="auto"/>
+        <w:ind w:left="340" w:hanging="170"/>
+      </w:pPr>
+      <w:r>
+        <w:rPr>
+          <w:rFonts w:ascii="Arial" w:hAnsi="Arial"/>
+          <w:color w:val="619FB2"/>
+          <w:sz w:val="21"/>
+        </w:rPr>
+        <w:t xml:space="preserve">•  </w:t>
+      </w:r>
+      <w:r>
+        <w:rPr>
+          <w:rFonts w:ascii="Arial" w:hAnsi="Arial"/>
+          <w:b/>
+          <w:color w:val="333333"/>
+          <w:sz w:val="21"/>
+        </w:rPr>
+        <w:t xml:space="preserve">Passo 4 — Encerrar. </w:t>
+      </w:r>
+      <w:r>
+        <w:rPr>
+          <w:rFonts w:ascii="Arial" w:hAnsi="Arial"/>
+          <w:b w:val="0"/>
+          <w:color w:val="333333"/>
+          <w:sz w:val="21"/>
+        </w:rPr>
+        <w:t>Dê um duplo clique em “Encerrar Apuracao.bat”. O app continua ativo até você encerrar (ou reiniciar o computador).</w:t>
       </w:r>
     </w:p>
     <w:tbl>
@@ -600,7 +632,7 @@
                 <w:color w:val="333333"/>
                 <w:sz w:val="20"/>
               </w:rPr>
-              <w:t>Nas próximas vezes, basta dar duplo clique de novo — a instalação acontece uma única vez.</w:t>
+              <w:t>Nas próximas vezes, basta dar duplo clique no “Iniciar Apuracao.bat” de novo — a instalação acontece uma única vez.</w:t>
             </w:r>
           </w:p>
         </w:tc>
@@ -772,7 +804,7 @@
       <w:r>
         <w:drawing>
           <wp:inline>
-            <wp:extent cx="5616000" cy="1448928"/>
+            <wp:extent cx="5616000" cy="1336608"/>
             <wp:docPr id="2" name="Picture 2"/>
             <wp:cNvGraphicFramePr>
               <a:graphicFrameLocks noChangeAspect="1"/>
@@ -793,7 +825,7 @@
                   <pic:spPr>
                     <a:xfrm>
                       <a:off x="0" y="0"/>
-                      <a:ext cx="5616000" cy="1448928"/>
+                      <a:ext cx="5616000" cy="1336608"/>
                     </a:xfrm>
                     <a:prstGeom prst="rect"/>
                   </pic:spPr>
@@ -844,7 +876,7 @@
           <w:color w:val="333333"/>
           <w:sz w:val="21"/>
         </w:rPr>
-        <w:t>Para cada prêmio há um bloco com as dezenas sorteadas, quantas cartelas venceram e a tabela dos certificados contemplados — número do certificado e as 20 dezenas de cada cartela.</w:t>
+        <w:t>Para cada prêmio há um bloco com as dezenas sorteadas, quantas cartelas venceram e a tabela dos contemplados — número do certificado, número da sorte do giro vencedor e as 20 dezenas de cada cartela.</w:t>
       </w:r>
     </w:p>
     <w:p>
@@ -855,7 +887,7 @@
       <w:r>
         <w:drawing>
           <wp:inline>
-            <wp:extent cx="5616000" cy="1881360"/>
+            <wp:extent cx="5616000" cy="1999296"/>
             <wp:docPr id="3" name="Picture 3"/>
             <wp:cNvGraphicFramePr>
               <a:graphicFrameLocks noChangeAspect="1"/>
@@ -876,7 +908,7 @@
                   <pic:spPr>
                     <a:xfrm>
                       <a:off x="0" y="0"/>
-                      <a:ext cx="5616000" cy="1881360"/>
+                      <a:ext cx="5616000" cy="1999296"/>
                     </a:xfrm>
                     <a:prstGeom prst="rect"/>
                   </pic:spPr>
@@ -938,7 +970,7 @@
       <w:r>
         <w:drawing>
           <wp:inline>
-            <wp:extent cx="4320000" cy="613440"/>
+            <wp:extent cx="4320000" cy="540000"/>
             <wp:docPr id="4" name="Picture 4"/>
             <wp:cNvGraphicFramePr>
               <a:graphicFrameLocks noChangeAspect="1"/>
@@ -959,7 +991,7 @@
                   <pic:spPr>
                     <a:xfrm>
                       <a:off x="0" y="0"/>
-                      <a:ext cx="4320000" cy="613440"/>
+                      <a:ext cx="4320000" cy="540000"/>
                     </a:xfrm>
                     <a:prstGeom prst="rect"/>
                   </pic:spPr>
@@ -1010,7 +1042,7 @@
           <w:color w:val="333333"/>
           <w:sz w:val="21"/>
         </w:rPr>
-        <w:t>Para cada prêmio, o app compara os certificados que ele calculou com os que constam oficialmente na Ata de Sorteio:</w:t>
+        <w:t>Para cada prêmio, o app compara os certificados que ele calculou com os que constam oficialmente na Ata de Sorteio (o número da sorte é apenas informativo, não entra na validação):</w:t>
       </w:r>
     </w:p>
     <w:p>
@@ -1085,7 +1117,7 @@
       <w:r>
         <w:drawing>
           <wp:inline>
-            <wp:extent cx="5616000" cy="2100384"/>
+            <wp:extent cx="5616000" cy="2504736"/>
             <wp:docPr id="5" name="Picture 5"/>
             <wp:cNvGraphicFramePr>
               <a:graphicFrameLocks noChangeAspect="1"/>
@@ -1106,7 +1138,7 @@
                   <pic:spPr>
                     <a:xfrm>
                       <a:off x="0" y="0"/>
-                      <a:ext cx="5616000" cy="2100384"/>
+                      <a:ext cx="5616000" cy="2504736"/>
                     </a:xfrm>
                     <a:prstGeom prst="rect"/>
                   </pic:spPr>

</xml_diff>